<commit_message>
docs+chore: refresh technical docs, add doc/diagnostic tooling
- Append a June 2026 update section (ICP import, blog interlinking, landing v2)
  to the Architecture, Backend Workflow, and Tech Stack docs; add a one-page
  session summary doc.
- Add helper scripts: docx-tool (read/append docx), make-session-doc,
  meta-ads/verify-connection (Meta API connection checker, unused until creds set).
- Document Meta Marketing API env vars in .env.example; ignore Office ~$ lock files.

Co-Authored-By: Claude Opus 4.8 <noreply@anthropic.com>
</commit_message>
<xml_diff>
--- a/Flowfiy_Architecture_v2.docx
+++ b/Flowfiy_Architecture_v2.docx
@@ -19525,6 +19525,70 @@
       <w:pPr>
         <w:spacing w:after="0" w:before="400"/>
       </w:pPr>
+    </w:p>
+    <w:p>
+      <w:pPr>
+        <w:pStyle w:val="Heading1"/>
+      </w:pPr>
+      <w:r>
+        <w:t xml:space="preserve">June 2026 Update — ICP Import Subsystem, Blog Interlinking &amp; Landing v2</w:t>
+      </w:r>
+    </w:p>
+    <w:p>
+      <w:pPr>
+        <w:pStyle w:val="Heading2"/>
+      </w:pPr>
+      <w:r>
+        <w:t xml:space="preserve">ICP Import Subsystem (Onboarding)</w:t>
+      </w:r>
+    </w:p>
+    <w:p>
+      <w:pPr>
+        <w:spacing w:before="120" w:after="60"/>
+      </w:pPr>
+      <w:r>
+        <w:t xml:space="preserve">A new subsystem turns a company website URL into a draft business profile during onboarding, alongside the existing manual entry path. Components: a website scraper (src/lib/website-scraper.ts) that SSRF-guards and fetches the homepage plus up to four high-signal pages and reduces them to about 35,000 characters of text; a Claude Haiku extraction agent (src/ai/agents/profile-extractor.ts) that returns a structured, sanitized ProfileDraft; and an authenticated API route (POST /api/business-profile/analyze-website) that returns the draft without persisting it.</w:t>
+      </w:r>
+    </w:p>
+    <w:p>
+      <w:pPr>
+        <w:spacing w:before="120" w:after="60"/>
+      </w:pPr>
+      <w:r>
+        <w:t xml:space="preserve">Data flow: URL to scraper (homepage plus up to four pages) to Haiku extractor to ProfileDraft to prefilled onboarding form to the existing business-profile upsert. The feature is gated by src/lib/feature-flags.ts; while disabled the route returns HTTP 503 and the UI shows Coming soon.</w:t>
+      </w:r>
+    </w:p>
+    <w:p>
+      <w:pPr>
+        <w:pStyle w:val="Heading2"/>
+      </w:pPr>
+      <w:r>
+        <w:t xml:space="preserve">Frontend — Landing v2</w:t>
+      </w:r>
+    </w:p>
+    <w:p>
+      <w:pPr>
+        <w:spacing w:before="120" w:after="60"/>
+      </w:pPr>
+      <w:r>
+        <w:t xml:space="preserve">The homepage at / is now served by src/components/landing/v2/LandingPageV2. It uses a raw WebGL fragment-shader hero (cursor-reactive aurora, no three.js), Lenis smooth-scroll, a bespoke custom cursor, and a framer-motion primitive system. Sections include a pinned scroll-driven story of the five-agent pipeline, a horizontal scroll-snap feature rail, asymmetric proof stats, a 24/7 interlude, reskinned pricing with the geo/INR logic preserved, editorial testimonials, and a convergence CTA. New dependency: lenis. The previous LandingPage component is retained in the repo but no longer rendered.</w:t>
+      </w:r>
+    </w:p>
+    <w:p>
+      <w:pPr>
+        <w:pStyle w:val="Heading2"/>
+      </w:pPr>
+      <w:r>
+        <w:t xml:space="preserve">Blog Interlinking</w:t>
+      </w:r>
+    </w:p>
+    <w:p>
+      <w:pPr>
+        <w:spacing w:before="120" w:after="60"/>
+      </w:pPr>
+      <w:r>
+        <w:t xml:space="preserve">markdownToHtml now renders [text](/blog/slug) markdown as internal anchor links so posts can cross-reference each other for SEO.</w:t>
+      </w:r>
     </w:p>
     <w:p>
       <w:pPr>

</xml_diff>